<commit_message>
Can now see db on port 8080
</commit_message>
<xml_diff>
--- a/docs/Contributions Matrix Template.docx
+++ b/docs/Contributions Matrix Template.docx
@@ -843,7 +843,7 @@
               <w:spacing w:after="160" w:line="278" w:lineRule="auto"/>
             </w:pPr>
             <w:r>
-              <w:t>60</w:t>
+              <w:t>90</w:t>
             </w:r>
           </w:p>
         </w:tc>
@@ -935,10 +935,7 @@
               <w:spacing w:after="160" w:line="278" w:lineRule="auto"/>
             </w:pPr>
             <w:r>
-              <w:t>3</w:t>
-            </w:r>
-            <w:r>
-              <w:t>5</w:t>
+              <w:t>60</w:t>
             </w:r>
           </w:p>
         </w:tc>
@@ -1030,7 +1027,7 @@
               <w:spacing w:after="160" w:line="278" w:lineRule="auto"/>
             </w:pPr>
             <w:r>
-              <w:t>30</w:t>
+              <w:t>60</w:t>
             </w:r>
           </w:p>
         </w:tc>
@@ -1121,6 +1118,9 @@
             <w:pPr>
               <w:spacing w:after="160" w:line="278" w:lineRule="auto"/>
             </w:pPr>
+            <w:r>
+              <w:t>50</w:t>
+            </w:r>
           </w:p>
         </w:tc>
         <w:tc>
@@ -1665,7 +1665,7 @@
               <w:spacing w:after="160" w:line="278" w:lineRule="auto"/>
             </w:pPr>
             <w:r>
-              <w:t>25</w:t>
+              <w:t>50</w:t>
             </w:r>
           </w:p>
         </w:tc>
@@ -1936,7 +1936,7 @@
               <w:spacing w:after="160" w:line="278" w:lineRule="auto"/>
             </w:pPr>
             <w:r>
-              <w:t>25</w:t>
+              <w:t>40</w:t>
             </w:r>
           </w:p>
         </w:tc>
@@ -2041,39 +2041,51 @@
             <w:pPr>
               <w:spacing w:after="160" w:line="278" w:lineRule="auto"/>
             </w:pPr>
-          </w:p>
-        </w:tc>
-        <w:tc>
-          <w:tcPr>
-            <w:tcW w:w="0" w:type="auto"/>
-            <w:hideMark/>
-          </w:tcPr>
-          <w:p>
-            <w:pPr>
-              <w:spacing w:after="160" w:line="278" w:lineRule="auto"/>
-            </w:pPr>
-          </w:p>
-        </w:tc>
-        <w:tc>
-          <w:tcPr>
-            <w:tcW w:w="0" w:type="auto"/>
-            <w:hideMark/>
-          </w:tcPr>
-          <w:p>
-            <w:pPr>
-              <w:spacing w:after="160" w:line="278" w:lineRule="auto"/>
-            </w:pPr>
-          </w:p>
-        </w:tc>
-        <w:tc>
-          <w:tcPr>
-            <w:tcW w:w="0" w:type="auto"/>
-            <w:hideMark/>
-          </w:tcPr>
-          <w:p>
-            <w:pPr>
-              <w:spacing w:after="160" w:line="278" w:lineRule="auto"/>
-            </w:pPr>
+            <w:r>
+              <w:t>0</w:t>
+            </w:r>
+          </w:p>
+        </w:tc>
+        <w:tc>
+          <w:tcPr>
+            <w:tcW w:w="0" w:type="auto"/>
+            <w:hideMark/>
+          </w:tcPr>
+          <w:p>
+            <w:pPr>
+              <w:spacing w:after="160" w:line="278" w:lineRule="auto"/>
+            </w:pPr>
+            <w:r>
+              <w:t>0</w:t>
+            </w:r>
+          </w:p>
+        </w:tc>
+        <w:tc>
+          <w:tcPr>
+            <w:tcW w:w="0" w:type="auto"/>
+            <w:hideMark/>
+          </w:tcPr>
+          <w:p>
+            <w:pPr>
+              <w:spacing w:after="160" w:line="278" w:lineRule="auto"/>
+            </w:pPr>
+            <w:r>
+              <w:t>0</w:t>
+            </w:r>
+          </w:p>
+        </w:tc>
+        <w:tc>
+          <w:tcPr>
+            <w:tcW w:w="0" w:type="auto"/>
+            <w:hideMark/>
+          </w:tcPr>
+          <w:p>
+            <w:pPr>
+              <w:spacing w:after="160" w:line="278" w:lineRule="auto"/>
+            </w:pPr>
+            <w:r>
+              <w:t>0</w:t>
+            </w:r>
           </w:p>
         </w:tc>
         <w:tc>
@@ -2133,39 +2145,51 @@
             <w:pPr>
               <w:spacing w:after="160" w:line="278" w:lineRule="auto"/>
             </w:pPr>
-          </w:p>
-        </w:tc>
-        <w:tc>
-          <w:tcPr>
-            <w:tcW w:w="0" w:type="auto"/>
-            <w:hideMark/>
-          </w:tcPr>
-          <w:p>
-            <w:pPr>
-              <w:spacing w:after="160" w:line="278" w:lineRule="auto"/>
-            </w:pPr>
-          </w:p>
-        </w:tc>
-        <w:tc>
-          <w:tcPr>
-            <w:tcW w:w="0" w:type="auto"/>
-            <w:hideMark/>
-          </w:tcPr>
-          <w:p>
-            <w:pPr>
-              <w:spacing w:after="160" w:line="278" w:lineRule="auto"/>
-            </w:pPr>
-          </w:p>
-        </w:tc>
-        <w:tc>
-          <w:tcPr>
-            <w:tcW w:w="0" w:type="auto"/>
-            <w:hideMark/>
-          </w:tcPr>
-          <w:p>
-            <w:pPr>
-              <w:spacing w:after="160" w:line="278" w:lineRule="auto"/>
-            </w:pPr>
+            <w:r>
+              <w:t>0</w:t>
+            </w:r>
+          </w:p>
+        </w:tc>
+        <w:tc>
+          <w:tcPr>
+            <w:tcW w:w="0" w:type="auto"/>
+            <w:hideMark/>
+          </w:tcPr>
+          <w:p>
+            <w:pPr>
+              <w:spacing w:after="160" w:line="278" w:lineRule="auto"/>
+            </w:pPr>
+            <w:r>
+              <w:t>0</w:t>
+            </w:r>
+          </w:p>
+        </w:tc>
+        <w:tc>
+          <w:tcPr>
+            <w:tcW w:w="0" w:type="auto"/>
+            <w:hideMark/>
+          </w:tcPr>
+          <w:p>
+            <w:pPr>
+              <w:spacing w:after="160" w:line="278" w:lineRule="auto"/>
+            </w:pPr>
+            <w:r>
+              <w:t>0</w:t>
+            </w:r>
+          </w:p>
+        </w:tc>
+        <w:tc>
+          <w:tcPr>
+            <w:tcW w:w="0" w:type="auto"/>
+            <w:hideMark/>
+          </w:tcPr>
+          <w:p>
+            <w:pPr>
+              <w:spacing w:after="160" w:line="278" w:lineRule="auto"/>
+            </w:pPr>
+            <w:r>
+              <w:t>0</w:t>
+            </w:r>
           </w:p>
         </w:tc>
         <w:tc>
@@ -2390,7 +2414,7 @@
               <w:spacing w:after="160" w:line="278" w:lineRule="auto"/>
             </w:pPr>
             <w:r>
-              <w:t>30</w:t>
+              <w:t>50</w:t>
             </w:r>
           </w:p>
         </w:tc>
@@ -2572,33 +2596,49 @@
           </w:tcPr>
           <w:p>
             <w:r>
-              <w:t>80</w:t>
-            </w:r>
-          </w:p>
-        </w:tc>
-        <w:tc>
-          <w:tcPr>
-            <w:tcW w:w="0" w:type="auto"/>
-          </w:tcPr>
-          <w:p/>
-        </w:tc>
-        <w:tc>
-          <w:tcPr>
-            <w:tcW w:w="0" w:type="auto"/>
-          </w:tcPr>
-          <w:p/>
-        </w:tc>
-        <w:tc>
-          <w:tcPr>
-            <w:tcW w:w="0" w:type="auto"/>
-          </w:tcPr>
-          <w:p/>
-        </w:tc>
-        <w:tc>
-          <w:tcPr>
-            <w:tcW w:w="0" w:type="auto"/>
-          </w:tcPr>
-          <w:p/>
+              <w:t>100</w:t>
+            </w:r>
+          </w:p>
+        </w:tc>
+        <w:tc>
+          <w:tcPr>
+            <w:tcW w:w="0" w:type="auto"/>
+          </w:tcPr>
+          <w:p>
+            <w:r>
+              <w:t>0</w:t>
+            </w:r>
+          </w:p>
+        </w:tc>
+        <w:tc>
+          <w:tcPr>
+            <w:tcW w:w="0" w:type="auto"/>
+          </w:tcPr>
+          <w:p>
+            <w:r>
+              <w:t>0</w:t>
+            </w:r>
+          </w:p>
+        </w:tc>
+        <w:tc>
+          <w:tcPr>
+            <w:tcW w:w="0" w:type="auto"/>
+          </w:tcPr>
+          <w:p>
+            <w:r>
+              <w:t>0</w:t>
+            </w:r>
+          </w:p>
+        </w:tc>
+        <w:tc>
+          <w:tcPr>
+            <w:tcW w:w="0" w:type="auto"/>
+          </w:tcPr>
+          <w:p>
+            <w:r>
+              <w:t>0</w:t>
+            </w:r>
+          </w:p>
         </w:tc>
         <w:tc>
           <w:tcPr>

</xml_diff>

<commit_message>
Recurring order logic updated
</commit_message>
<xml_diff>
--- a/docs/Contributions Matrix Template.docx
+++ b/docs/Contributions Matrix Template.docx
@@ -44,7 +44,18 @@
         <w:t>Tutor:</w:t>
       </w:r>
       <w:r>
-        <w:t xml:space="preserve"> _______ </w:t>
+        <w:rPr>
+          <w:b/>
+          <w:bCs/>
+        </w:rPr>
+        <w:t xml:space="preserve"> </w:t>
+      </w:r>
+      <w:r>
+        <w:rPr>
+          <w:b/>
+          <w:bCs/>
+        </w:rPr>
+        <w:t>Yan Liu</w:t>
       </w:r>
     </w:p>
     <w:p>
@@ -372,6 +383,9 @@
             <w:r>
               <w:t>implementation and CRUD operation</w:t>
             </w:r>
+            <w:r>
+              <w:t>. API implementation for payment and image hosting</w:t>
+            </w:r>
           </w:p>
         </w:tc>
       </w:tr>
@@ -425,7 +439,11 @@
               <w:spacing w:after="160" w:line="278" w:lineRule="auto"/>
             </w:pPr>
             <w:r>
-              <w:t>Order management, notification management, receipt downloads, commission implementation, reorder of basket, changing status of order, order notification in producer login</w:t>
+              <w:t xml:space="preserve">Order management, notification management, receipt downloads, commission implementation, reorder of basket, changing status of </w:t>
+            </w:r>
+            <w:r>
+              <w:lastRenderedPageBreak/>
+              <w:t>order, order notification in producer login</w:t>
             </w:r>
           </w:p>
         </w:tc>
@@ -942,21 +960,21 @@
               <w:spacing w:after="160" w:line="278" w:lineRule="auto"/>
             </w:pPr>
             <w:r>
-              <w:t>45</w:t>
-            </w:r>
-          </w:p>
-        </w:tc>
-        <w:tc>
-          <w:tcPr>
-            <w:tcW w:w="0" w:type="auto"/>
-            <w:hideMark/>
-          </w:tcPr>
-          <w:p>
-            <w:pPr>
-              <w:spacing w:after="160" w:line="278" w:lineRule="auto"/>
-            </w:pPr>
-            <w:r>
-              <w:t>45</w:t>
+              <w:t>55</w:t>
+            </w:r>
+          </w:p>
+        </w:tc>
+        <w:tc>
+          <w:tcPr>
+            <w:tcW w:w="0" w:type="auto"/>
+            <w:hideMark/>
+          </w:tcPr>
+          <w:p>
+            <w:pPr>
+              <w:spacing w:after="160" w:line="278" w:lineRule="auto"/>
+            </w:pPr>
+            <w:r>
+              <w:t>35</w:t>
             </w:r>
           </w:p>
         </w:tc>
@@ -1037,21 +1055,21 @@
               <w:spacing w:after="160" w:line="278" w:lineRule="auto"/>
             </w:pPr>
             <w:r>
-              <w:t>45</w:t>
-            </w:r>
-          </w:p>
-        </w:tc>
-        <w:tc>
-          <w:tcPr>
-            <w:tcW w:w="0" w:type="auto"/>
-            <w:hideMark/>
-          </w:tcPr>
-          <w:p>
-            <w:pPr>
-              <w:spacing w:after="160" w:line="278" w:lineRule="auto"/>
-            </w:pPr>
-            <w:r>
-              <w:t>45</w:t>
+              <w:t>60</w:t>
+            </w:r>
+          </w:p>
+        </w:tc>
+        <w:tc>
+          <w:tcPr>
+            <w:tcW w:w="0" w:type="auto"/>
+            <w:hideMark/>
+          </w:tcPr>
+          <w:p>
+            <w:pPr>
+              <w:spacing w:after="160" w:line="278" w:lineRule="auto"/>
+            </w:pPr>
+            <w:r>
+              <w:t>30</w:t>
             </w:r>
           </w:p>
         </w:tc>
@@ -1227,21 +1245,21 @@
               <w:spacing w:after="160" w:line="278" w:lineRule="auto"/>
             </w:pPr>
             <w:r>
-              <w:t>40</w:t>
-            </w:r>
-          </w:p>
-        </w:tc>
-        <w:tc>
-          <w:tcPr>
-            <w:tcW w:w="0" w:type="auto"/>
-            <w:hideMark/>
-          </w:tcPr>
-          <w:p>
-            <w:pPr>
-              <w:spacing w:after="160" w:line="278" w:lineRule="auto"/>
-            </w:pPr>
-            <w:r>
-              <w:t>40</w:t>
+              <w:t>60</w:t>
+            </w:r>
+          </w:p>
+        </w:tc>
+        <w:tc>
+          <w:tcPr>
+            <w:tcW w:w="0" w:type="auto"/>
+            <w:hideMark/>
+          </w:tcPr>
+          <w:p>
+            <w:pPr>
+              <w:spacing w:after="160" w:line="278" w:lineRule="auto"/>
+            </w:pPr>
+            <w:r>
+              <w:t>35</w:t>
             </w:r>
           </w:p>
         </w:tc>
@@ -1322,24 +1340,21 @@
               <w:spacing w:after="160" w:line="278" w:lineRule="auto"/>
             </w:pPr>
             <w:r>
-              <w:t>4</w:t>
-            </w:r>
-            <w:r>
-              <w:t>0</w:t>
-            </w:r>
-          </w:p>
-        </w:tc>
-        <w:tc>
-          <w:tcPr>
-            <w:tcW w:w="0" w:type="auto"/>
-            <w:hideMark/>
-          </w:tcPr>
-          <w:p>
-            <w:pPr>
-              <w:spacing w:after="160" w:line="278" w:lineRule="auto"/>
-            </w:pPr>
-            <w:r>
-              <w:t>40</w:t>
+              <w:t>50</w:t>
+            </w:r>
+          </w:p>
+        </w:tc>
+        <w:tc>
+          <w:tcPr>
+            <w:tcW w:w="0" w:type="auto"/>
+            <w:hideMark/>
+          </w:tcPr>
+          <w:p>
+            <w:pPr>
+              <w:spacing w:after="160" w:line="278" w:lineRule="auto"/>
+            </w:pPr>
+            <w:r>
+              <w:t>35</w:t>
             </w:r>
           </w:p>
         </w:tc>
@@ -1788,6 +1803,9 @@
             <w:pPr>
               <w:spacing w:after="160" w:line="278" w:lineRule="auto"/>
             </w:pPr>
+            <w:r>
+              <w:t>66</w:t>
+            </w:r>
           </w:p>
         </w:tc>
         <w:tc>
@@ -2267,21 +2285,21 @@
               <w:spacing w:after="160" w:line="278" w:lineRule="auto"/>
             </w:pPr>
             <w:r>
-              <w:t>45</w:t>
-            </w:r>
-          </w:p>
-        </w:tc>
-        <w:tc>
-          <w:tcPr>
-            <w:tcW w:w="0" w:type="auto"/>
-            <w:hideMark/>
-          </w:tcPr>
-          <w:p>
-            <w:pPr>
-              <w:spacing w:after="160" w:line="278" w:lineRule="auto"/>
-            </w:pPr>
-            <w:r>
-              <w:t>45</w:t>
+              <w:t>55</w:t>
+            </w:r>
+          </w:p>
+        </w:tc>
+        <w:tc>
+          <w:tcPr>
+            <w:tcW w:w="0" w:type="auto"/>
+            <w:hideMark/>
+          </w:tcPr>
+          <w:p>
+            <w:pPr>
+              <w:spacing w:after="160" w:line="278" w:lineRule="auto"/>
+            </w:pPr>
+            <w:r>
+              <w:t>35</w:t>
             </w:r>
           </w:p>
         </w:tc>
@@ -2545,6 +2563,9 @@
             <w:pPr>
               <w:spacing w:after="160" w:line="278" w:lineRule="auto"/>
             </w:pPr>
+            <w:r>
+              <w:t>66</w:t>
+            </w:r>
           </w:p>
         </w:tc>
         <w:tc>
@@ -3198,7 +3219,15 @@
     </w:p>
     <w:p>
       <w:r>
-        <w:t>If Yes, describe the disagreement and how it was resolved:</w:t>
+        <w:t xml:space="preserve">If </w:t>
+      </w:r>
+      <w:proofErr w:type="gramStart"/>
+      <w:r>
+        <w:t>Yes</w:t>
+      </w:r>
+      <w:proofErr w:type="gramEnd"/>
+      <w:r>
+        <w:t>, describe the disagreement and how it was resolved:</w:t>
       </w:r>
     </w:p>
     <w:p>
@@ -5301,7 +5330,6 @@
   <w:style w:type="character" w:default="1" w:styleId="DefaultParagraphFont">
     <w:name w:val="Default Paragraph Font"/>
     <w:uiPriority w:val="1"/>
-    <w:semiHidden/>
     <w:unhideWhenUsed/>
   </w:style>
   <w:style w:type="table" w:default="1" w:styleId="TableNormal">
@@ -5933,18 +5961,18 @@
 </file>
 
 <file path=customXml/item1.xml><?xml version="1.0" encoding="utf-8"?>
+<p:properties xmlns:p="http://schemas.microsoft.com/office/2006/metadata/properties" xmlns:xsi="http://www.w3.org/2001/XMLSchema-instance" xmlns:pc="http://schemas.microsoft.com/office/infopath/2007/PartnerControls">
+  <documentManagement/>
+</p:properties>
+</file>
+
+<file path=customXml/item2.xml><?xml version="1.0" encoding="utf-8"?>
 <?mso-contentType ?>
 <FormTemplates xmlns="http://schemas.microsoft.com/sharepoint/v3/contenttype/forms">
   <Display>DocumentLibraryForm</Display>
   <Edit>DocumentLibraryForm</Edit>
   <New>DocumentLibraryForm</New>
 </FormTemplates>
-</file>
-
-<file path=customXml/item2.xml><?xml version="1.0" encoding="utf-8"?>
-<p:properties xmlns:p="http://schemas.microsoft.com/office/2006/metadata/properties" xmlns:xsi="http://www.w3.org/2001/XMLSchema-instance" xmlns:pc="http://schemas.microsoft.com/office/infopath/2007/PartnerControls">
-  <documentManagement/>
-</p:properties>
 </file>
 
 <file path=customXml/item3.xml><?xml version="1.0" encoding="utf-8"?>
@@ -6125,18 +6153,18 @@
 </file>
 
 <file path=customXml/itemProps1.xml><?xml version="1.0" encoding="utf-8"?>
-<ds:datastoreItem xmlns:ds="http://schemas.openxmlformats.org/officeDocument/2006/customXml" ds:itemID="{5F6F9A2D-1D3B-41DE-8302-FB51888A6922}">
+<ds:datastoreItem xmlns:ds="http://schemas.openxmlformats.org/officeDocument/2006/customXml" ds:itemID="{572EE966-8595-4EA7-89F6-16FAF4E911AC}">
   <ds:schemaRefs>
-    <ds:schemaRef ds:uri="http://schemas.microsoft.com/sharepoint/v3/contenttype/forms"/>
+    <ds:schemaRef ds:uri="http://schemas.microsoft.com/office/2006/metadata/properties"/>
+    <ds:schemaRef ds:uri="http://schemas.microsoft.com/office/infopath/2007/PartnerControls"/>
   </ds:schemaRefs>
 </ds:datastoreItem>
 </file>
 
 <file path=customXml/itemProps2.xml><?xml version="1.0" encoding="utf-8"?>
-<ds:datastoreItem xmlns:ds="http://schemas.openxmlformats.org/officeDocument/2006/customXml" ds:itemID="{572EE966-8595-4EA7-89F6-16FAF4E911AC}">
+<ds:datastoreItem xmlns:ds="http://schemas.openxmlformats.org/officeDocument/2006/customXml" ds:itemID="{5F6F9A2D-1D3B-41DE-8302-FB51888A6922}">
   <ds:schemaRefs>
-    <ds:schemaRef ds:uri="http://schemas.microsoft.com/office/2006/metadata/properties"/>
-    <ds:schemaRef ds:uri="http://schemas.microsoft.com/office/infopath/2007/PartnerControls"/>
+    <ds:schemaRef ds:uri="http://schemas.microsoft.com/sharepoint/v3/contenttype/forms"/>
   </ds:schemaRefs>
 </ds:datastoreItem>
 </file>

</xml_diff>